<commit_message>
docs: arahkan link UTS di README ke repositori mandiri petcareUTSMobile
</commit_message>
<xml_diff>
--- a/petcareUTSMobile/Laporan_UTS_PetCare_Muhammad_Refki_Andesta_REVISED.docx
+++ b/petcareUTSMobile/Laporan_UTS_PetCare_Muhammad_Refki_Andesta_REVISED.docx
@@ -142,119 +142,69 @@
         <w:spacing w:before="120" w:after="40"/>
         <w:jc w:val="center"/>
       </w:pPr>
-      <w:proofErr w:type="spellStart"/>
       <w:r>
         <w:rPr>
           <w:rFonts w:eastAsia="Times New Roman" w:cs="Times New Roman"/>
           <w:b/>
         </w:rPr>
-        <w:t>Disusun</w:t>
-      </w:r>
-      <w:proofErr w:type="spellEnd"/>
-      <w:r>
+        <w:t>Disusun Oleh:</w:t>
+      </w:r>
+    </w:p>
+    <w:p>
+      <w:pPr>
+        <w:spacing w:after="720"/>
+        <w:jc w:val="center"/>
+      </w:pPr>
+      <w:r>
+        <w:rPr>
+          <w:rFonts w:eastAsia="Times New Roman" w:cs="Times New Roman"/>
+        </w:rPr>
+        <w:t>Muhammad Refki Andesta</w:t>
+      </w:r>
+      <w:r>
+        <w:rPr>
+          <w:rFonts w:eastAsia="Times New Roman" w:cs="Times New Roman"/>
+        </w:rPr>
+        <w:br/>
+        <w:t>NIM: 240605110232</w:t>
+      </w:r>
+      <w:r>
+        <w:rPr>
+          <w:rFonts w:eastAsia="Times New Roman" w:cs="Times New Roman"/>
+        </w:rPr>
+        <w:br/>
+        <w:t>Kelas: Praktikum Mobile Programming</w:t>
+      </w:r>
+    </w:p>
+    <w:p>
+      <w:pPr>
+        <w:spacing w:before="240" w:after="0"/>
+        <w:jc w:val="center"/>
         <w:rPr>
           <w:rFonts w:eastAsia="Times New Roman" w:cs="Times New Roman"/>
           <w:b/>
         </w:rPr>
-        <w:t xml:space="preserve"> Oleh:</w:t>
-      </w:r>
-    </w:p>
-    <w:p>
-      <w:pPr>
-        <w:spacing w:after="720"/>
-        <w:jc w:val="center"/>
-      </w:pPr>
-      <w:r>
-        <w:rPr>
-          <w:rFonts w:eastAsia="Times New Roman" w:cs="Times New Roman"/>
-        </w:rPr>
-        <w:t xml:space="preserve">Muhammad </w:t>
-      </w:r>
-      <w:proofErr w:type="spellStart"/>
-      <w:r>
-        <w:rPr>
-          <w:rFonts w:eastAsia="Times New Roman" w:cs="Times New Roman"/>
-        </w:rPr>
-        <w:t>Refki</w:t>
-      </w:r>
-      <w:proofErr w:type="spellEnd"/>
-      <w:r>
-        <w:rPr>
-          <w:rFonts w:eastAsia="Times New Roman" w:cs="Times New Roman"/>
-        </w:rPr>
-        <w:t xml:space="preserve"> </w:t>
-      </w:r>
-      <w:proofErr w:type="spellStart"/>
-      <w:r>
-        <w:rPr>
-          <w:rFonts w:eastAsia="Times New Roman" w:cs="Times New Roman"/>
-        </w:rPr>
-        <w:t>Andesta</w:t>
-      </w:r>
-      <w:proofErr w:type="spellEnd"/>
-      <w:r>
-        <w:rPr>
-          <w:rFonts w:eastAsia="Times New Roman" w:cs="Times New Roman"/>
-        </w:rPr>
-        <w:br/>
-        <w:t>NIM: 240605110232</w:t>
-      </w:r>
-      <w:r>
-        <w:rPr>
-          <w:rFonts w:eastAsia="Times New Roman" w:cs="Times New Roman"/>
-        </w:rPr>
-        <w:br/>
-      </w:r>
-      <w:proofErr w:type="spellStart"/>
-      <w:r>
-        <w:rPr>
-          <w:rFonts w:eastAsia="Times New Roman" w:cs="Times New Roman"/>
-        </w:rPr>
-        <w:t>Kelas</w:t>
-      </w:r>
-      <w:proofErr w:type="spellEnd"/>
-      <w:r>
-        <w:rPr>
-          <w:rFonts w:eastAsia="Times New Roman" w:cs="Times New Roman"/>
-        </w:rPr>
-        <w:t xml:space="preserve">: </w:t>
-      </w:r>
-      <w:proofErr w:type="spellStart"/>
-      <w:r>
-        <w:rPr>
-          <w:rFonts w:eastAsia="Times New Roman" w:cs="Times New Roman"/>
-        </w:rPr>
-        <w:t>Praktikum</w:t>
-      </w:r>
-      <w:proofErr w:type="spellEnd"/>
-      <w:r>
-        <w:rPr>
-          <w:rFonts w:eastAsia="Times New Roman" w:cs="Times New Roman"/>
-        </w:rPr>
-        <w:t xml:space="preserve"> Mobile Programming</w:t>
-      </w:r>
+      </w:pPr>
     </w:p>
     <w:p>
       <w:pPr>
         <w:spacing w:before="240" w:after="0"/>
         <w:jc w:val="center"/>
+      </w:pPr>
+      <w:r>
         <w:rPr>
           <w:rFonts w:eastAsia="Times New Roman" w:cs="Times New Roman"/>
           <w:b/>
         </w:rPr>
-      </w:pPr>
-    </w:p>
-    <w:p>
-      <w:pPr>
-        <w:spacing w:before="240" w:after="0"/>
-        <w:jc w:val="center"/>
-      </w:pPr>
+        <w:t>PROGRAM STUDI TEKNIK INFORMATIKA</w:t>
+      </w:r>
       <w:r>
         <w:rPr>
           <w:rFonts w:eastAsia="Times New Roman" w:cs="Times New Roman"/>
           <w:b/>
         </w:rPr>
-        <w:t>PROGRAM STUDI TEKNIK INFORMATIKA</w:t>
+        <w:br/>
+        <w:t>FAKULTAS SAINS DAN TEKNOLOGI</w:t>
       </w:r>
       <w:r>
         <w:rPr>
@@ -262,7 +212,7 @@
           <w:b/>
         </w:rPr>
         <w:br/>
-        <w:t>FAKULTAS SAINS DAN TEKNOLOGI</w:t>
+        <w:t>UNIVERSITAS ISLAM NEGERI MAULANA MALIK IBRAHIM MALANG</w:t>
       </w:r>
       <w:r>
         <w:rPr>
@@ -270,119 +220,7 @@
           <w:b/>
         </w:rPr>
         <w:br/>
-        <w:t>UNIVERSITAS ISLAM NEGERI MAULANA MALIK IBRAHIM MALANG</w:t>
-      </w:r>
-      <w:r>
-        <w:rPr>
-          <w:rFonts w:eastAsia="Times New Roman" w:cs="Times New Roman"/>
-          <w:b/>
-        </w:rPr>
-        <w:br/>
         <w:t>2026</w:t>
-      </w:r>
-    </w:p>
-    <w:p>
-      <w:pPr>
-        <w:keepNext/>
-        <w:spacing w:before="360" w:after="240"/>
-        <w:jc w:val="center"/>
-      </w:pPr>
-      <w:r>
-        <w:rPr>
-          <w:rFonts w:eastAsia="Times New Roman" w:cs="Times New Roman"/>
-          <w:b/>
-          <w:sz w:val="28"/>
-        </w:rPr>
-        <w:lastRenderedPageBreak/>
-        <w:t>KATA PENGANTAR</w:t>
-      </w:r>
-    </w:p>
-    <w:p>
-      <w:pPr>
-        <w:spacing w:after="120" w:line="360" w:lineRule="auto"/>
-        <w:ind w:firstLine="720"/>
-        <w:jc w:val="both"/>
-      </w:pPr>
-      <w:r>
-        <w:rPr>
-          <w:rFonts w:eastAsia="Times New Roman" w:cs="Times New Roman"/>
-        </w:rPr>
-        <w:t>Puji dan syukur penulis panjatkan ke hadirat Allah SWT atas segala limpahan rahmat dan karunia-Nya, sehingga laporan Ujian Tengah Semester (UTS) Praktikum Mobile Programming dengan judul "Pengembangan Aplikasi Mobile PetCare Berbasis Flutter dengan Arsitektur MVVM dan JSON Lokal" dapat diselesaikan dengan baik.</w:t>
-      </w:r>
-    </w:p>
-    <w:p>
-      <w:pPr>
-        <w:spacing w:after="120" w:line="360" w:lineRule="auto"/>
-        <w:ind w:firstLine="720"/>
-        <w:jc w:val="both"/>
-      </w:pPr>
-      <w:r>
-        <w:rPr>
-          <w:rFonts w:eastAsia="Times New Roman" w:cs="Times New Roman"/>
-        </w:rPr>
-        <w:t>Laporan ini disusun guna mendokumentasikan proses analisis kebutuhan, perancangan antarmuka pengguna (UI/UX), implementasi kode program, serta evaluasi sistem aplikasi panduan perawatan hewan berbasis framework Flutter. Aplikasi PetCare dirancang untuk memudahkan pemilik hewan dalam mempelajari prosedur perawatan harian secara bertahap dan dapat diakses secara luring tanpa ketergantungan koneksi internet.</w:t>
-      </w:r>
-    </w:p>
-    <w:p>
-      <w:pPr>
-        <w:spacing w:after="120" w:line="360" w:lineRule="auto"/>
-        <w:ind w:firstLine="720"/>
-        <w:jc w:val="both"/>
-      </w:pPr>
-      <w:r>
-        <w:rPr>
-          <w:rFonts w:eastAsia="Times New Roman" w:cs="Times New Roman"/>
-        </w:rPr>
-        <w:t>Penulis mengucapkan terima kasih yang sebesar-besarnya kepada Ibu Khadijah Fahmi Hayati Holle, S.Kom., M.Kom selaku Dosen Pengampu mata kuliah Praktikum Mobile Programming atas bimbingan dan arahan akademis yang diberikan. Ucapan terima kasih juga disampaikan kepada rekan-rekan mahasiswa Teknik Informatika atas kerja sama dan dukungannya.</w:t>
-      </w:r>
-    </w:p>
-    <w:p>
-      <w:pPr>
-        <w:spacing w:after="120" w:line="360" w:lineRule="auto"/>
-        <w:ind w:firstLine="720"/>
-        <w:jc w:val="both"/>
-      </w:pPr>
-      <w:r>
-        <w:rPr>
-          <w:rFonts w:eastAsia="Times New Roman" w:cs="Times New Roman"/>
-        </w:rPr>
-        <w:t>Penulis menyadari bahwa laporan ini masih memiliki ruang penyempurnaan. Oleh sebab itu, kritik dan saran konstruktif dari pembaca sangat diharapkan demi perbaikan di masa mendatang. Semoga laporan ini dapat memberikan manfaat bagi pembaca dan pengembangan perangkat lunak mobile.</w:t>
-      </w:r>
-    </w:p>
-    <w:p>
-      <w:pPr>
-        <w:spacing w:before="360" w:after="0"/>
-        <w:jc w:val="right"/>
-      </w:pPr>
-      <w:r>
-        <w:rPr>
-          <w:rFonts w:eastAsia="Times New Roman" w:cs="Times New Roman"/>
-        </w:rPr>
-        <w:t>Malang, Oktober 2026</w:t>
-      </w:r>
-      <w:r>
-        <w:rPr>
-          <w:rFonts w:eastAsia="Times New Roman" w:cs="Times New Roman"/>
-        </w:rPr>
-        <w:br/>
-      </w:r>
-      <w:r>
-        <w:rPr>
-          <w:rFonts w:eastAsia="Times New Roman" w:cs="Times New Roman"/>
-        </w:rPr>
-        <w:br/>
-      </w:r>
-      <w:r>
-        <w:rPr>
-          <w:rFonts w:eastAsia="Times New Roman" w:cs="Times New Roman"/>
-        </w:rPr>
-        <w:br/>
-        <w:t>Penulis</w:t>
-      </w:r>
-    </w:p>
-    <w:p>
-      <w:r>
-        <w:br w:type="page"/>
       </w:r>
     </w:p>
     <w:p>
@@ -3176,23 +3014,23 @@
           <w:rFonts w:ascii="Consolas" w:hAnsi="Consolas"/>
           <w:sz w:val="18"/>
         </w:rPr>
-        <w:t xml:space="preserve">void </w:t>
-      </w:r>
-      <w:proofErr w:type="gramStart"/>
+        <w:t>void main() {</w:t>
+      </w:r>
       <w:r>
         <w:rPr>
           <w:rFonts w:ascii="Consolas" w:hAnsi="Consolas"/>
           <w:sz w:val="18"/>
         </w:rPr>
-        <w:t>main(</w:t>
-      </w:r>
-      <w:proofErr w:type="gramEnd"/>
+        <w:br/>
+        <w:t xml:space="preserve">  runApp(const PetCareApp());</w:t>
+      </w:r>
       <w:r>
         <w:rPr>
           <w:rFonts w:ascii="Consolas" w:hAnsi="Consolas"/>
           <w:sz w:val="18"/>
         </w:rPr>
-        <w:t>) {</w:t>
+        <w:br/>
+        <w:t>}</w:t>
       </w:r>
       <w:r>
         <w:rPr>
@@ -3200,23 +3038,22 @@
           <w:sz w:val="18"/>
         </w:rPr>
         <w:br/>
-        <w:t xml:space="preserve">  runApp(const </w:t>
-      </w:r>
-      <w:proofErr w:type="gramStart"/>
+      </w:r>
       <w:r>
         <w:rPr>
           <w:rFonts w:ascii="Consolas" w:hAnsi="Consolas"/>
           <w:sz w:val="18"/>
         </w:rPr>
-        <w:t>PetCareApp(</w:t>
-      </w:r>
-      <w:proofErr w:type="gramEnd"/>
+        <w:br/>
+        <w:t>const accent = Color(0xFFFFAE45);</w:t>
+      </w:r>
       <w:r>
         <w:rPr>
           <w:rFonts w:ascii="Consolas" w:hAnsi="Consolas"/>
           <w:sz w:val="18"/>
         </w:rPr>
-        <w:t>));</w:t>
+        <w:br/>
+        <w:t>final colors = ColorScheme.fromSeed(</w:t>
       </w:r>
       <w:r>
         <w:rPr>
@@ -3224,7 +3061,7 @@
           <w:sz w:val="18"/>
         </w:rPr>
         <w:br/>
-        <w:t>}</w:t>
+        <w:t xml:space="preserve">  seedColor: accent,</w:t>
       </w:r>
       <w:r>
         <w:rPr>
@@ -3232,6 +3069,7 @@
           <w:sz w:val="18"/>
         </w:rPr>
         <w:br/>
+        <w:t xml:space="preserve">  brightness: Brightness.light,</w:t>
       </w:r>
       <w:r>
         <w:rPr>
@@ -3239,54 +3077,7 @@
           <w:sz w:val="18"/>
         </w:rPr>
         <w:br/>
-        <w:t>const accent = Color(0xFFFFAE45);</w:t>
-      </w:r>
-      <w:r>
-        <w:rPr>
-          <w:rFonts w:ascii="Consolas" w:hAnsi="Consolas"/>
-          <w:sz w:val="18"/>
-        </w:rPr>
-        <w:br/>
-        <w:t>final colors = ColorScheme.fromSeed(</w:t>
-      </w:r>
-      <w:r>
-        <w:rPr>
-          <w:rFonts w:ascii="Consolas" w:hAnsi="Consolas"/>
-          <w:sz w:val="18"/>
-        </w:rPr>
-        <w:br/>
-        <w:t xml:space="preserve">  seedColor: accent,</w:t>
-      </w:r>
-      <w:r>
-        <w:rPr>
-          <w:rFonts w:ascii="Consolas" w:hAnsi="Consolas"/>
-          <w:sz w:val="18"/>
-        </w:rPr>
-        <w:br/>
-        <w:t xml:space="preserve">  brightness: Brightness.light,</w:t>
-      </w:r>
-      <w:r>
-        <w:rPr>
-          <w:rFonts w:ascii="Consolas" w:hAnsi="Consolas"/>
-          <w:sz w:val="18"/>
-        </w:rPr>
-        <w:br/>
-      </w:r>
-      <w:proofErr w:type="gramStart"/>
-      <w:r>
-        <w:rPr>
-          <w:rFonts w:ascii="Consolas" w:hAnsi="Consolas"/>
-          <w:sz w:val="18"/>
-        </w:rPr>
-        <w:t>).copyWith</w:t>
-      </w:r>
-      <w:proofErr w:type="gramEnd"/>
-      <w:r>
-        <w:rPr>
-          <w:rFonts w:ascii="Consolas" w:hAnsi="Consolas"/>
-          <w:sz w:val="18"/>
-        </w:rPr>
-        <w:t>(</w:t>
+        <w:t>).copyWith(</w:t>
       </w:r>
       <w:r>
         <w:rPr>
@@ -3357,25 +3148,7 @@
           <w:b/>
           <w:i/>
         </w:rPr>
-        <w:t xml:space="preserve">3.5.2 Berkas lib/model/care_guide.dart — Model Domain </w:t>
-      </w:r>
-      <w:proofErr w:type="spellStart"/>
-      <w:r>
-        <w:rPr>
-          <w:rFonts w:eastAsia="Times New Roman" w:cs="Times New Roman"/>
-          <w:b/>
-          <w:i/>
-        </w:rPr>
-        <w:t>Entitas</w:t>
-      </w:r>
-      <w:proofErr w:type="spellEnd"/>
-      <w:r>
-        <w:rPr>
-          <w:rFonts w:eastAsia="Times New Roman" w:cs="Times New Roman"/>
-          <w:b/>
-          <w:i/>
-        </w:rPr>
-        <w:t xml:space="preserve"> Panduan</w:t>
+        <w:t>3.5.2 Berkas lib/model/care_guide.dart — Model Domain Entitas Panduan</w:t>
       </w:r>
     </w:p>
     <w:p>
@@ -3647,43 +3420,7 @@
           <w:i/>
         </w:rPr>
         <w:lastRenderedPageBreak/>
-        <w:t xml:space="preserve">3.5.3 Berkas lib/data/guide_repository.dart — Pemuatan dan </w:t>
-      </w:r>
-      <w:proofErr w:type="spellStart"/>
-      <w:r>
-        <w:rPr>
-          <w:rFonts w:eastAsia="Times New Roman" w:cs="Times New Roman"/>
-          <w:b/>
-          <w:i/>
-        </w:rPr>
-        <w:t>Validasi</w:t>
-      </w:r>
-      <w:proofErr w:type="spellEnd"/>
-      <w:r>
-        <w:rPr>
-          <w:rFonts w:eastAsia="Times New Roman" w:cs="Times New Roman"/>
-          <w:b/>
-          <w:i/>
-        </w:rPr>
-        <w:t xml:space="preserve"> </w:t>
-      </w:r>
-      <w:proofErr w:type="spellStart"/>
-      <w:r>
-        <w:rPr>
-          <w:rFonts w:eastAsia="Times New Roman" w:cs="Times New Roman"/>
-          <w:b/>
-          <w:i/>
-        </w:rPr>
-        <w:t>Integritas</w:t>
-      </w:r>
-      <w:proofErr w:type="spellEnd"/>
-      <w:r>
-        <w:rPr>
-          <w:rFonts w:eastAsia="Times New Roman" w:cs="Times New Roman"/>
-          <w:b/>
-          <w:i/>
-        </w:rPr>
-        <w:t xml:space="preserve"> JSON</w:t>
+        <w:t>3.5.3 Berkas lib/data/guide_repository.dart — Pemuatan dan Validasi Integritas JSON</w:t>
       </w:r>
     </w:p>
     <w:p>
@@ -3740,23 +3477,23 @@
           <w:rFonts w:ascii="Consolas" w:hAnsi="Consolas"/>
           <w:sz w:val="18"/>
         </w:rPr>
-        <w:t xml:space="preserve">Future&lt;GuideCatalog&gt; </w:t>
-      </w:r>
-      <w:proofErr w:type="gramStart"/>
+        <w:t>Future&lt;GuideCatalog&gt; load() async {</w:t>
+      </w:r>
       <w:r>
         <w:rPr>
           <w:rFonts w:ascii="Consolas" w:hAnsi="Consolas"/>
           <w:sz w:val="18"/>
         </w:rPr>
-        <w:t>load(</w:t>
-      </w:r>
-      <w:proofErr w:type="gramEnd"/>
+        <w:br/>
+        <w:t xml:space="preserve">  final jsonText = await rootBundle.loadString(</w:t>
+      </w:r>
       <w:r>
         <w:rPr>
           <w:rFonts w:ascii="Consolas" w:hAnsi="Consolas"/>
           <w:sz w:val="18"/>
         </w:rPr>
-        <w:t>) async {</w:t>
+        <w:br/>
+        <w:t xml:space="preserve">    'assets/data/guides.json',</w:t>
       </w:r>
       <w:r>
         <w:rPr>
@@ -3764,7 +3501,7 @@
           <w:sz w:val="18"/>
         </w:rPr>
         <w:br/>
-        <w:t xml:space="preserve">  final jsonText = await rootBundle.loadString(</w:t>
+        <w:t xml:space="preserve">  );</w:t>
       </w:r>
       <w:r>
         <w:rPr>
@@ -3772,7 +3509,7 @@
           <w:sz w:val="18"/>
         </w:rPr>
         <w:br/>
-        <w:t xml:space="preserve">    'assets/data/guides.json',</w:t>
+        <w:t xml:space="preserve">  return parseCatalog(jsonText);</w:t>
       </w:r>
       <w:r>
         <w:rPr>
@@ -3780,7 +3517,7 @@
           <w:sz w:val="18"/>
         </w:rPr>
         <w:br/>
-        <w:t xml:space="preserve">  );</w:t>
+        <w:t>}</w:t>
       </w:r>
       <w:r>
         <w:rPr>
@@ -3788,7 +3525,6 @@
           <w:sz w:val="18"/>
         </w:rPr>
         <w:br/>
-        <w:t xml:space="preserve">  return parseCatalog(jsonText);</w:t>
       </w:r>
       <w:r>
         <w:rPr>
@@ -3796,38 +3532,7 @@
           <w:sz w:val="18"/>
         </w:rPr>
         <w:br/>
-        <w:t>}</w:t>
-      </w:r>
-      <w:r>
-        <w:rPr>
-          <w:rFonts w:ascii="Consolas" w:hAnsi="Consolas"/>
-          <w:sz w:val="18"/>
-        </w:rPr>
-        <w:br/>
-      </w:r>
-      <w:r>
-        <w:rPr>
-          <w:rFonts w:ascii="Consolas" w:hAnsi="Consolas"/>
-          <w:sz w:val="18"/>
-        </w:rPr>
-        <w:br/>
-        <w:t xml:space="preserve">GuideCatalog </w:t>
-      </w:r>
-      <w:proofErr w:type="gramStart"/>
-      <w:r>
-        <w:rPr>
-          <w:rFonts w:ascii="Consolas" w:hAnsi="Consolas"/>
-          <w:sz w:val="18"/>
-        </w:rPr>
-        <w:t>parseCatalog(</w:t>
-      </w:r>
-      <w:proofErr w:type="gramEnd"/>
-      <w:r>
-        <w:rPr>
-          <w:rFonts w:ascii="Consolas" w:hAnsi="Consolas"/>
-          <w:sz w:val="18"/>
-        </w:rPr>
-        <w:t>String jsonText) {</w:t>
+        <w:t>GuideCatalog parseCatalog(String jsonText) {</w:t>
       </w:r>
       <w:r>
         <w:rPr>
@@ -3884,18 +3589,8 @@
           <w:b/>
           <w:i/>
         </w:rPr>
-        <w:t xml:space="preserve">3.5.4 Berkas lib/viewmodel/guide_viewmodel.dart — Logika State, Filter, dan </w:t>
-      </w:r>
-      <w:proofErr w:type="spellStart"/>
-      <w:r>
-        <w:rPr>
-          <w:rFonts w:eastAsia="Times New Roman" w:cs="Times New Roman"/>
-          <w:b/>
-          <w:i/>
-        </w:rPr>
-        <w:t>Pencarian</w:t>
-      </w:r>
-      <w:proofErr w:type="spellEnd"/>
+        <w:t>3.5.4 Berkas lib/viewmodel/guide_viewmodel.dart — Logika State, Filter, dan Pencarian</w:t>
+      </w:r>
     </w:p>
     <w:p>
       <w:pPr>
@@ -4133,36 +3828,8 @@
           <w:b/>
           <w:i/>
         </w:rPr>
-        <w:t xml:space="preserve">3.5.5 Berkas lib/view/widgets.dart — Widget Kartu Modular yang Dapat </w:t>
-      </w:r>
-      <w:proofErr w:type="spellStart"/>
-      <w:r>
-        <w:rPr>
-          <w:rFonts w:eastAsia="Times New Roman" w:cs="Times New Roman"/>
-          <w:b/>
-          <w:i/>
-        </w:rPr>
-        <w:t>Digunakan</w:t>
-      </w:r>
-      <w:proofErr w:type="spellEnd"/>
-      <w:r>
-        <w:rPr>
-          <w:rFonts w:eastAsia="Times New Roman" w:cs="Times New Roman"/>
-          <w:b/>
-          <w:i/>
-        </w:rPr>
-        <w:t xml:space="preserve"> </w:t>
-      </w:r>
-      <w:proofErr w:type="spellStart"/>
-      <w:r>
-        <w:rPr>
-          <w:rFonts w:eastAsia="Times New Roman" w:cs="Times New Roman"/>
-          <w:b/>
-          <w:i/>
-        </w:rPr>
-        <w:t>Ulang</w:t>
-      </w:r>
-      <w:proofErr w:type="spellEnd"/>
+        <w:t>3.5.5 Berkas lib/view/widgets.dart — Widget Kartu Modular yang Dapat Digunakan Ulang</w:t>
+      </w:r>
     </w:p>
     <w:p>
       <w:pPr>
@@ -4456,18 +4123,8 @@
           <w:i/>
         </w:rPr>
         <w:lastRenderedPageBreak/>
-        <w:t xml:space="preserve">3.5.6 Berkas lib/view/home_page.dart — Shell Aplikasi, Tab Bar, dan Rute </w:t>
-      </w:r>
-      <w:proofErr w:type="spellStart"/>
-      <w:r>
-        <w:rPr>
-          <w:rFonts w:eastAsia="Times New Roman" w:cs="Times New Roman"/>
-          <w:b/>
-          <w:i/>
-        </w:rPr>
-        <w:t>Navigasi</w:t>
-      </w:r>
-      <w:proofErr w:type="spellEnd"/>
+        <w:t>3.5.6 Berkas lib/view/home_page.dart — Shell Aplikasi, Tab Bar, dan Rute Navigasi</w:t>
+      </w:r>
     </w:p>
     <w:p>
       <w:pPr>
@@ -4705,43 +4362,7 @@
           <w:b/>
           <w:i/>
         </w:rPr>
-        <w:t xml:space="preserve">3.5.7 Berkas lib/view/guide_pages.dart — Antarmuka Filter </w:t>
-      </w:r>
-      <w:proofErr w:type="spellStart"/>
-      <w:r>
-        <w:rPr>
-          <w:rFonts w:eastAsia="Times New Roman" w:cs="Times New Roman"/>
-          <w:b/>
-          <w:i/>
-        </w:rPr>
-        <w:t>Katalog</w:t>
-      </w:r>
-      <w:proofErr w:type="spellEnd"/>
-      <w:r>
-        <w:rPr>
-          <w:rFonts w:eastAsia="Times New Roman" w:cs="Times New Roman"/>
-          <w:b/>
-          <w:i/>
-        </w:rPr>
-        <w:t xml:space="preserve"> dan </w:t>
-      </w:r>
-      <w:proofErr w:type="spellStart"/>
-      <w:r>
-        <w:rPr>
-          <w:rFonts w:eastAsia="Times New Roman" w:cs="Times New Roman"/>
-          <w:b/>
-          <w:i/>
-        </w:rPr>
-        <w:t>Rincian</w:t>
-      </w:r>
-      <w:proofErr w:type="spellEnd"/>
-      <w:r>
-        <w:rPr>
-          <w:rFonts w:eastAsia="Times New Roman" w:cs="Times New Roman"/>
-          <w:b/>
-          <w:i/>
-        </w:rPr>
-        <w:t xml:space="preserve"> Panduan</w:t>
+        <w:t>3.5.7 Berkas lib/view/guide_pages.dart — Antarmuka Filter Katalog dan Rincian Panduan</w:t>
       </w:r>
     </w:p>
     <w:p>
@@ -5005,36 +4626,8 @@
           <w:i/>
         </w:rPr>
         <w:lastRenderedPageBreak/>
-        <w:t xml:space="preserve">3.5.8 Berkas lib/view/about_page.dart — Halaman </w:t>
-      </w:r>
-      <w:proofErr w:type="spellStart"/>
-      <w:r>
-        <w:rPr>
-          <w:rFonts w:eastAsia="Times New Roman" w:cs="Times New Roman"/>
-          <w:b/>
-          <w:i/>
-        </w:rPr>
-        <w:t>Informasi</w:t>
-      </w:r>
-      <w:proofErr w:type="spellEnd"/>
-      <w:r>
-        <w:rPr>
-          <w:rFonts w:eastAsia="Times New Roman" w:cs="Times New Roman"/>
-          <w:b/>
-          <w:i/>
-        </w:rPr>
-        <w:t xml:space="preserve"> dan Panduan </w:t>
-      </w:r>
-      <w:proofErr w:type="spellStart"/>
-      <w:r>
-        <w:rPr>
-          <w:rFonts w:eastAsia="Times New Roman" w:cs="Times New Roman"/>
-          <w:b/>
-          <w:i/>
-        </w:rPr>
-        <w:t>Penggunaan</w:t>
-      </w:r>
-      <w:proofErr w:type="spellEnd"/>
+        <w:t>3.5.8 Berkas lib/view/about_page.dart — Halaman Informasi dan Panduan Penggunaan</w:t>
+      </w:r>
     </w:p>
     <w:p>
       <w:pPr>
@@ -7951,41 +7544,20 @@
         <w:spacing w:after="60"/>
         <w:ind w:left="576" w:hanging="288"/>
       </w:pPr>
-      <w:proofErr w:type="spellStart"/>
       <w:r>
         <w:rPr>
           <w:rFonts w:eastAsia="Times New Roman" w:cs="Times New Roman"/>
         </w:rPr>
-        <w:t>Tautan</w:t>
-      </w:r>
-      <w:proofErr w:type="spellEnd"/>
-      <w:r>
-        <w:rPr>
-          <w:rFonts w:eastAsia="Times New Roman" w:cs="Times New Roman"/>
-        </w:rPr>
-        <w:t xml:space="preserve"> </w:t>
-      </w:r>
-      <w:proofErr w:type="spellStart"/>
-      <w:r>
-        <w:rPr>
-          <w:rFonts w:eastAsia="Times New Roman" w:cs="Times New Roman"/>
-        </w:rPr>
-        <w:t>Repositori</w:t>
-      </w:r>
-      <w:proofErr w:type="spellEnd"/>
-      <w:r>
-        <w:rPr>
-          <w:rFonts w:eastAsia="Times New Roman" w:cs="Times New Roman"/>
-        </w:rPr>
-        <w:t xml:space="preserve"> GitHub: </w:t>
+        <w:t xml:space="preserve">Tautan Repositori GitHub: </w:t>
       </w:r>
       <w:hyperlink r:id="rId26" w:history="1">
         <w:r>
           <w:rPr>
             <w:rStyle w:val="Hyperlink"/>
             <w:rFonts w:eastAsia="Times New Roman" w:cs="Times New Roman"/>
+            <w:color w:val="548DD4" w:themeColor="text2" w:themeTint="99"/>
           </w:rPr>
-          <w:t>https://github.com/Refki515/Praktikum-Pemrograman-Mobile</w:t>
+          <w:t>https://github.com/Refki515/Praktikum-Pemrograman-Mobile/tree/main/petcareUTSMobile</w:t>
         </w:r>
       </w:hyperlink>
     </w:p>
@@ -7995,47 +7567,11 @@
         <w:spacing w:after="60"/>
         <w:ind w:left="576" w:hanging="288"/>
       </w:pPr>
-      <w:proofErr w:type="spellStart"/>
       <w:r>
         <w:rPr>
           <w:rFonts w:eastAsia="Times New Roman" w:cs="Times New Roman"/>
         </w:rPr>
-        <w:t>Tautan</w:t>
-      </w:r>
-      <w:proofErr w:type="spellEnd"/>
-      <w:r>
-        <w:rPr>
-          <w:rFonts w:eastAsia="Times New Roman" w:cs="Times New Roman"/>
-        </w:rPr>
-        <w:t xml:space="preserve"> </w:t>
-      </w:r>
-      <w:proofErr w:type="spellStart"/>
-      <w:r>
-        <w:rPr>
-          <w:rFonts w:eastAsia="Times New Roman" w:cs="Times New Roman"/>
-        </w:rPr>
-        <w:t>Penjelasan</w:t>
-      </w:r>
-      <w:proofErr w:type="spellEnd"/>
-      <w:r>
-        <w:rPr>
-          <w:rFonts w:eastAsia="Times New Roman" w:cs="Times New Roman"/>
-        </w:rPr>
-        <w:t xml:space="preserve"> Program </w:t>
-      </w:r>
-      <w:proofErr w:type="spellStart"/>
-      <w:r>
-        <w:rPr>
-          <w:rFonts w:eastAsia="Times New Roman" w:cs="Times New Roman"/>
-        </w:rPr>
-        <w:t>Youtube</w:t>
-      </w:r>
-      <w:proofErr w:type="spellEnd"/>
-      <w:r>
-        <w:rPr>
-          <w:rFonts w:eastAsia="Times New Roman" w:cs="Times New Roman"/>
-        </w:rPr>
-        <w:t xml:space="preserve">: </w:t>
+        <w:t xml:space="preserve">Tautan Penjelasan Program Youtube: </w:t>
       </w:r>
       <w:hyperlink r:id="rId27" w:history="1">
         <w:r>
@@ -8099,44 +7635,11 @@
   <w:p>
     <w:pPr>
       <w:pStyle w:val="Footer"/>
-      <w:jc w:val="right"/>
+      <w:tabs>
+        <w:tab w:val="center" w:pos="4135"/>
+        <w:tab w:val="right" w:pos="8271"/>
+      </w:tabs>
     </w:pPr>
-    <w:proofErr w:type="spellStart"/>
-    <w:r>
-      <w:rPr>
-        <w:rFonts w:eastAsia="Times New Roman" w:cs="Times New Roman"/>
-        <w:i/>
-        <w:sz w:val="18"/>
-      </w:rPr>
-      <w:t>Laporan</w:t>
-    </w:r>
-    <w:proofErr w:type="spellEnd"/>
-    <w:r>
-      <w:rPr>
-        <w:rFonts w:eastAsia="Times New Roman" w:cs="Times New Roman"/>
-        <w:i/>
-        <w:sz w:val="18"/>
-      </w:rPr>
-      <w:t xml:space="preserve"> UTS </w:t>
-    </w:r>
-    <w:proofErr w:type="spellStart"/>
-    <w:r>
-      <w:rPr>
-        <w:rFonts w:eastAsia="Times New Roman" w:cs="Times New Roman"/>
-        <w:i/>
-        <w:sz w:val="18"/>
-      </w:rPr>
-      <w:t>Praktikum</w:t>
-    </w:r>
-    <w:proofErr w:type="spellEnd"/>
-    <w:r>
-      <w:rPr>
-        <w:rFonts w:eastAsia="Times New Roman" w:cs="Times New Roman"/>
-        <w:i/>
-        <w:sz w:val="18"/>
-      </w:rPr>
-      <w:t xml:space="preserve"> Mobile Programming | PetCare</w:t>
-    </w:r>
   </w:p>
 </w:ftr>
 </file>

</xml_diff>